<commit_message>
Add API test collections
</commit_message>
<xml_diff>
--- a/Defect Report Register.docx
+++ b/Defect Report Register.docx
@@ -1,6 +1,6 @@
 
 <file path=word/document.xml><?xml version="1.0" encoding="utf-8"?>
-<w:document xmlns:wpc="http://schemas.microsoft.com/office/word/2010/wordprocessingCanvas" xmlns:cx="http://schemas.microsoft.com/office/drawing/2014/chartex" xmlns:cx1="http://schemas.microsoft.com/office/drawing/2015/9/8/chartex" xmlns:cx2="http://schemas.microsoft.com/office/drawing/2015/10/21/chartex" xmlns:cx3="http://schemas.microsoft.com/office/drawing/2016/5/9/chartex" xmlns:cx4="http://schemas.microsoft.com/office/drawing/2016/5/10/chartex" xmlns:cx5="http://schemas.microsoft.com/office/drawing/2016/5/11/chartex" xmlns:cx6="http://schemas.microsoft.com/office/drawing/2016/5/12/chartex" xmlns:cx7="http://schemas.microsoft.com/office/drawing/2016/5/13/chartex" xmlns:cx8="http://schemas.microsoft.com/office/drawing/2016/5/14/chartex" xmlns:mc="http://schemas.openxmlformats.org/markup-compatibility/2006" xmlns:aink="http://schemas.microsoft.com/office/drawing/2016/ink" xmlns:am3d="http://schemas.microsoft.com/office/drawing/2017/model3d" xmlns:o="urn:schemas-microsoft-com:office:office" xmlns:oel="http://schemas.microsoft.com/office/2019/extlst" xmlns:r="http://schemas.openxmlformats.org/officeDocument/2006/relationships" xmlns:m="http://schemas.openxmlformats.org/officeDocument/2006/math" xmlns:v="urn:schemas-microsoft-com:vml" xmlns:wp14="http://schemas.microsoft.com/office/word/2010/wordprocessingDrawing" xmlns:wp="http://schemas.openxmlformats.org/drawingml/2006/wordprocessingDrawing" xmlns:w10="urn:schemas-microsoft-com:office:word" xmlns:w="http://schemas.openxmlformats.org/wordprocessingml/2006/main" xmlns:w14="http://schemas.microsoft.com/office/word/2010/wordml" xmlns:w15="http://schemas.microsoft.com/office/word/2012/wordml" xmlns:w16cei="http://schemas.microsoft.com/office/word/2026/wordml/cei" xmlns:w16cex="http://schemas.microsoft.com/office/word/2018/wordml/cex" xmlns:w16cid="http://schemas.microsoft.com/office/word/2016/wordml/cid" xmlns:w16="http://schemas.microsoft.com/office/word/2018/wordml" xmlns:w16du="http://schemas.microsoft.com/office/word/2023/wordml/word16du" xmlns:w16sdtdh="http://schemas.microsoft.com/office/word/2020/wordml/sdtdatahash" xmlns:w16sdtfl="http://schemas.microsoft.com/office/word/2024/wordml/sdtformatlock" xmlns:w16se="http://schemas.microsoft.com/office/word/2015/wordml/symex" xmlns:wpg="http://schemas.microsoft.com/office/word/2010/wordprocessingGroup" xmlns:wpi="http://schemas.microsoft.com/office/word/2010/wordprocessingInk" xmlns:wne="http://schemas.microsoft.com/office/word/2006/wordml" xmlns:wps="http://schemas.microsoft.com/office/word/2010/wordprocessingShape" mc:Ignorable="w14 w15 w16se w16cid w16 w16cex w16sdtdh w16sdtfl w16du wp14">
+<w:document xmlns:wpc="http://schemas.microsoft.com/office/word/2010/wordprocessingCanvas" xmlns:cx="http://schemas.microsoft.com/office/drawing/2014/chartex" xmlns:cx1="http://schemas.microsoft.com/office/drawing/2015/9/8/chartex" xmlns:cx2="http://schemas.microsoft.com/office/drawing/2015/10/21/chartex" xmlns:cx3="http://schemas.microsoft.com/office/drawing/2016/5/9/chartex" xmlns:cx4="http://schemas.microsoft.com/office/drawing/2016/5/10/chartex" xmlns:cx5="http://schemas.microsoft.com/office/drawing/2016/5/11/chartex" xmlns:cx6="http://schemas.microsoft.com/office/drawing/2016/5/12/chartex" xmlns:cx7="http://schemas.microsoft.com/office/drawing/2016/5/13/chartex" xmlns:cx8="http://schemas.microsoft.com/office/drawing/2016/5/14/chartex" xmlns:mc="http://schemas.openxmlformats.org/markup-compatibility/2006" xmlns:aink="http://schemas.microsoft.com/office/drawing/2016/ink" xmlns:am3d="http://schemas.microsoft.com/office/drawing/2017/model3d" xmlns:o="urn:schemas-microsoft-com:office:office" xmlns:oel="http://schemas.microsoft.com/office/2019/extlst" xmlns:r="http://schemas.openxmlformats.org/officeDocument/2006/relationships" xmlns:m="http://schemas.openxmlformats.org/officeDocument/2006/math" xmlns:v="urn:schemas-microsoft-com:vml" xmlns:wp14="http://schemas.microsoft.com/office/word/2010/wordprocessingDrawing" xmlns:wp="http://schemas.openxmlformats.org/drawingml/2006/wordprocessingDrawing" xmlns:w10="urn:schemas-microsoft-com:office:word" xmlns:w="http://schemas.openxmlformats.org/wordprocessingml/2006/main" xmlns:w14="http://schemas.microsoft.com/office/word/2010/wordml" xmlns:w15="http://schemas.microsoft.com/office/word/2012/wordml" xmlns:w16cex="http://schemas.microsoft.com/office/word/2018/wordml/cex" xmlns:w16cid="http://schemas.microsoft.com/office/word/2016/wordml/cid" xmlns:w16="http://schemas.microsoft.com/office/word/2018/wordml" xmlns:w16du="http://schemas.microsoft.com/office/word/2023/wordml/word16du" xmlns:w16sdtdh="http://schemas.microsoft.com/office/word/2020/wordml/sdtdatahash" xmlns:w16sdtfl="http://schemas.microsoft.com/office/word/2024/wordml/sdtformatlock" xmlns:w16se="http://schemas.microsoft.com/office/word/2015/wordml/symex" xmlns:wpg="http://schemas.microsoft.com/office/word/2010/wordprocessingGroup" xmlns:wpi="http://schemas.microsoft.com/office/word/2010/wordprocessingInk" xmlns:wne="http://schemas.microsoft.com/office/word/2006/wordml" xmlns:wps="http://schemas.microsoft.com/office/word/2010/wordprocessingShape" mc:Ignorable="w14 w15 w16se w16cid w16 w16cex w16sdtdh w16sdtfl w16du wp14">
   <w:body>
     <w:p>
       <w:pPr>
@@ -23,24 +23,7 @@
     </w:p>
     <w:p>
       <w:r>
-        <w:t xml:space="preserve">This serves as a Defect Report </w:t>
-      </w:r>
-      <w:r>
-        <w:t>Register</w:t>
-      </w:r>
-      <w:r>
-        <w:t xml:space="preserve"> to document, track, communicate, and manage defects identified during testing activities of </w:t>
-      </w:r>
-      <w:proofErr w:type="spellStart"/>
-      <w:r>
-        <w:t>Flash</w:t>
-      </w:r>
-      <w:r>
-        <w:t>Gateway</w:t>
-      </w:r>
-      <w:proofErr w:type="spellEnd"/>
-      <w:r>
-        <w:t xml:space="preserve">. It provides a centralized record of issues discovered </w:t>
+        <w:t xml:space="preserve">This serves as a Defect Report Register to document, track, communicate, and manage defects identified during testing activities of FlashGateway. It provides a centralized record of issues discovered </w:t>
       </w:r>
     </w:p>
     <w:p>
@@ -107,10 +90,10 @@
         <w:tblLook w:val="04A0" w:firstRow="1" w:lastRow="0" w:firstColumn="1" w:lastColumn="0" w:noHBand="0" w:noVBand="1"/>
       </w:tblPr>
       <w:tblGrid>
-        <w:gridCol w:w="1327"/>
+        <w:gridCol w:w="1325"/>
         <w:gridCol w:w="1338"/>
         <w:gridCol w:w="1368"/>
-        <w:gridCol w:w="1332"/>
+        <w:gridCol w:w="1334"/>
         <w:gridCol w:w="1330"/>
         <w:gridCol w:w="1328"/>
         <w:gridCol w:w="1327"/>
@@ -267,43 +250,102 @@
           <w:tcPr>
             <w:tcW w:w="1335" w:type="dxa"/>
           </w:tcPr>
-          <w:p/>
+          <w:p>
+            <w:r>
+              <w:t>DEF-UI-002</w:t>
+            </w:r>
+          </w:p>
         </w:tc>
         <w:tc>
           <w:tcPr>
             <w:tcW w:w="1335" w:type="dxa"/>
           </w:tcPr>
-          <w:p/>
-        </w:tc>
-        <w:tc>
-          <w:tcPr>
-            <w:tcW w:w="1336" w:type="dxa"/>
-          </w:tcPr>
-          <w:p/>
-        </w:tc>
-        <w:tc>
-          <w:tcPr>
-            <w:tcW w:w="1336" w:type="dxa"/>
-          </w:tcPr>
-          <w:p/>
-        </w:tc>
-        <w:tc>
-          <w:tcPr>
-            <w:tcW w:w="1336" w:type="dxa"/>
-          </w:tcPr>
-          <w:p/>
-        </w:tc>
-        <w:tc>
-          <w:tcPr>
-            <w:tcW w:w="1336" w:type="dxa"/>
-          </w:tcPr>
-          <w:p/>
-        </w:tc>
-        <w:tc>
-          <w:tcPr>
-            <w:tcW w:w="1336" w:type="dxa"/>
-          </w:tcPr>
-          <w:p/>
+          <w:p>
+            <w:r>
+              <w:t xml:space="preserve">Cannot create a </w:t>
+            </w:r>
+            <w:r>
+              <w:lastRenderedPageBreak/>
+              <w:t>new account.</w:t>
+            </w:r>
+          </w:p>
+        </w:tc>
+        <w:tc>
+          <w:tcPr>
+            <w:tcW w:w="1336" w:type="dxa"/>
+          </w:tcPr>
+          <w:p>
+            <w:r>
+              <w:lastRenderedPageBreak/>
+              <w:t xml:space="preserve">After filling in all the </w:t>
+            </w:r>
+            <w:r>
+              <w:lastRenderedPageBreak/>
+              <w:t>required fields a new account should be created and a success message should pop up.</w:t>
+            </w:r>
+          </w:p>
+        </w:tc>
+        <w:tc>
+          <w:tcPr>
+            <w:tcW w:w="1336" w:type="dxa"/>
+          </w:tcPr>
+          <w:p>
+            <w:r>
+              <w:lastRenderedPageBreak/>
+              <w:t xml:space="preserve">A </w:t>
+            </w:r>
+            <w:r>
+              <w:t>E</w:t>
+            </w:r>
+            <w:r>
+              <w:t>rror</w:t>
+            </w:r>
+            <w:r>
+              <w:t xml:space="preserve"> message </w:t>
+            </w:r>
+            <w:r>
+              <w:lastRenderedPageBreak/>
+              <w:t>pops up, “</w:t>
+            </w:r>
+            <w:r>
+              <w:t>Email, full name and password are required</w:t>
+            </w:r>
+            <w:r>
+              <w:t>”</w:t>
+            </w:r>
+          </w:p>
+          <w:p/>
+        </w:tc>
+        <w:tc>
+          <w:tcPr>
+            <w:tcW w:w="1336" w:type="dxa"/>
+          </w:tcPr>
+          <w:p>
+            <w:r>
+              <w:lastRenderedPageBreak/>
+              <w:t>High</w:t>
+            </w:r>
+          </w:p>
+        </w:tc>
+        <w:tc>
+          <w:tcPr>
+            <w:tcW w:w="1336" w:type="dxa"/>
+          </w:tcPr>
+          <w:p>
+            <w:r>
+              <w:t>High</w:t>
+            </w:r>
+          </w:p>
+        </w:tc>
+        <w:tc>
+          <w:tcPr>
+            <w:tcW w:w="1336" w:type="dxa"/>
+          </w:tcPr>
+          <w:p>
+            <w:r>
+              <w:t>Open</w:t>
+            </w:r>
+          </w:p>
         </w:tc>
       </w:tr>
       <w:tr>
@@ -1062,7 +1104,6 @@
   <w:style w:type="character" w:default="1" w:styleId="DefaultParagraphFont">
     <w:name w:val="Default Paragraph Font"/>
     <w:uiPriority w:val="1"/>
-    <w:semiHidden/>
     <w:unhideWhenUsed/>
   </w:style>
   <w:style w:type="table" w:default="1" w:styleId="TableNormal">

</xml_diff>